<commit_message>
Add executed notebooks (round 2); use verified dataset counts in report
Co-Authored-By: Claude Opus 5.5 <noreply@anthropic.com>
Claude-Session: https://claude.ai/code/session_01AWLf4Vf7U3nex8wdXcBp7P
</commit_message>
<xml_diff>
--- a/ISOM5240_GroupProject/report/Project_report.docx
+++ b/ISOM5240_GroupProject/report/Project_report.docx
@@ -1194,7 +1194,7 @@
         <w:t xml:space="preserve">515K Hotel Reviews Data in Europe</w:t>
       </w:r>
       <w:r>
-        <w:t xml:space="preserve">, roughly 515,000 Booking.com reviews of 1,493 European hotels (public domain), </w:t>
+        <w:t xml:space="preserve">: 515,738 Booking.com reviews of European hotels (public domain), </w:t>
       </w:r>
     </w:p>
     <w:p>
@@ -1204,7 +1204,7 @@
       <w:r>
         <w:t xml:space="preserve">Kaggle: </w:t>
       </w:r>
-      <w:hyperlink w:history="1" r:id="rIdh9cfbvs5kemz4jyfzshe_">
+      <w:hyperlink w:history="1" r:id="rIdujzyfmbr65yblvaim5_0h">
         <w:r>
           <w:rPr>
             <w:rStyle w:val="Hyperlink"/>
@@ -1215,7 +1215,7 @@
       <w:r>
         <w:t xml:space="preserve">. Prepared, labelled splits: </w:t>
       </w:r>
-      <w:hyperlink w:history="1" r:id="rIdjk2tpfxhudgablu5hv8m6">
+      <w:hyperlink w:history="1" r:id="rIdr_s51vg2urzb9x6dnmxoc">
         <w:r>
           <w:rPr>
             <w:rStyle w:val="Hyperlink"/>
@@ -1272,7 +1272,7 @@
         <w:t xml:space="preserve">disliked</w:t>
       </w:r>
       <w:r>
-        <w:t xml:space="preserve"> parts of a review separately and writes placeholders ("No Positive", "No Negative") when a part is empty. We removed the placeholders and joined both parts into one free-text review, then dropped empty and duplicate reviews.</w:t>
+        <w:t xml:space="preserve"> parts of a review separately and writes placeholders ("No Positive", "No Negative") when a part is empty. We removed the placeholders and joined both parts into one free-text review, then dropped empty and duplicate reviews, leaving 497,029 unique reviews (average 35 words).</w:t>
       </w:r>
     </w:p>
     <w:p>
@@ -1345,7 +1345,7 @@
         <w:t xml:space="preserve">Class balancing:</w:t>
       </w:r>
       <w:r>
-        <w:t xml:space="preserve"> positive reviews far outnumber negative ones, so we drew the same number of reviews per label (15,000) and split them 80/10/10 into train, validation and test sets, keeping label proportions equal (stratified, random seed 42).</w:t>
+        <w:t xml:space="preserve"> positive reviews far outnumber negative ones (235,952 vs. 39,354), and leisure reviews outnumber business ones (402,857 vs. 79,861), so we drew the same number of reviews per label (15,000) and split them 80/10/10 into train, validation and test sets, keeping label proportions equal (stratified, random seed 42).</w:t>
       </w:r>
     </w:p>
     <w:tbl>
@@ -2962,7 +2962,7 @@
       <w:r>
         <w:t xml:space="preserve">The app is deployed on Streamlit Community Cloud at </w:t>
       </w:r>
-      <w:hyperlink w:history="1" r:id="rIdrdvakvchsop450jleshal">
+      <w:hyperlink w:history="1" r:id="rIdytx9zl3fjke9bqy_0uizf">
         <w:r>
           <w:rPr>
             <w:rStyle w:val="Hyperlink"/>

</xml_diff>

<commit_message>
Prepare for submission: remove internal notes, add reproducibility note, link main branch
Co-Authored-By: Claude Opus 5.5 <noreply@anthropic.com>
Claude-Session: https://claude.ai/code/session_01AWLf4Vf7U3nex8wdXcBp7P
</commit_message>
<xml_diff>
--- a/ISOM5240_GroupProject/report/Project_report.docx
+++ b/ISOM5240_GroupProject/report/Project_report.docx
@@ -873,7 +873,7 @@
                 <w:sz w:val="18"/>
                 <w:szCs w:val="18"/>
               </w:rPr>
-              <w:t xml:space="preserve">https://github.com/ludanzhang54/MBA/tree/claude/homework-help-8tt9tf/ISOM5240_GroupProject</w:t>
+              <w:t xml:space="preserve">https://github.com/ludanzhang54/MBA/tree/main/ISOM5240_GroupProject</w:t>
             </w:r>
           </w:p>
         </w:tc>
@@ -1204,7 +1204,7 @@
       <w:r>
         <w:t xml:space="preserve">Kaggle: </w:t>
       </w:r>
-      <w:hyperlink w:history="1" r:id="rIdujzyfmbr65yblvaim5_0h">
+      <w:hyperlink w:history="1" r:id="rIdgovwbjwerbrfiy9zyc7zv">
         <w:r>
           <w:rPr>
             <w:rStyle w:val="Hyperlink"/>
@@ -1215,7 +1215,7 @@
       <w:r>
         <w:t xml:space="preserve">. Prepared, labelled splits: </w:t>
       </w:r>
-      <w:hyperlink w:history="1" r:id="rIdr_s51vg2urzb9x6dnmxoc">
+      <w:hyperlink w:history="1" r:id="rIdqk3horts08uub3gwp8xeg">
         <w:r>
           <w:rPr>
             <w:rStyle w:val="Hyperlink"/>
@@ -2949,6 +2949,31 @@
     </w:p>
     <w:p>
       <w:pPr>
+        <w:spacing w:after="100"/>
+      </w:pPr>
+      <w:r>
+        <w:rPr>
+          <w:b/>
+          <w:bCs/>
+        </w:rPr>
+        <w:t xml:space="preserve">Reproducibility.</w:t>
+      </w:r>
+      <w:r>
+        <w:t xml:space="preserve"> All random seeds are fixed (42), so the data sample and the train/validation/test splits are identical on every run. When the notebooks are re-run with </w:t>
+      </w:r>
+      <w:r>
+        <w:rPr>
+          <w:i/>
+          <w:iCs/>
+        </w:rPr>
+        <w:t xml:space="preserve">Restart &amp; Run All</w:t>
+      </w:r>
+      <w:r>
+        <w:t xml:space="preserve">, the GPU fine-tuning can change accuracy by a few tenths of a percentage point, because some GPU operations are not deterministic. The models used by the app and reported here are the exact ones uploaded to the Hugging Face Hub, and Notebook 03 evaluates those uploaded models directly.</w:t>
+      </w:r>
+    </w:p>
+    <w:p>
+      <w:pPr>
         <w:pStyle w:val="Heading1"/>
       </w:pPr>
       <w:r>
@@ -2962,7 +2987,7 @@
       <w:r>
         <w:t xml:space="preserve">The app is deployed on Streamlit Community Cloud at </w:t>
       </w:r>
-      <w:hyperlink w:history="1" r:id="rIdytx9zl3fjke9bqy_0uizf">
+      <w:hyperlink w:history="1" r:id="rIdh-7nb8rggxoegjrqa6uip">
         <w:r>
           <w:rPr>
             <w:rStyle w:val="Hyperlink"/>

</xml_diff>